<commit_message>
ui: compact operations workspace and govern density
</commit_message>
<xml_diff>
--- a/docs/commercialization/artifacts/OpsTrax_Accelerated_Hardening_Factory_v2.0.docx
+++ b/docs/commercialization/artifacts/OpsTrax_Accelerated_Hardening_Factory_v2.0.docx
@@ -40,13 +40,7 @@
         <w:pStyle w:val="Metadata"/>
       </w:pPr>
       <w:r>
-        <w:rPr>
-          <w:b/>
-        </w:rPr>
-        <w:t xml:space="preserve">Controlled plan revision: </w:t>
-      </w:r>
-      <w:r>
-        <w:t>2.7</w:t>
+        <w:t>Controlled plan revision: 2.8</w:t>
       </w:r>
     </w:p>
     <w:p>
@@ -54,13 +48,7 @@
         <w:pStyle w:val="Metadata"/>
       </w:pPr>
       <w:r>
-        <w:rPr>
-          <w:b/>
-        </w:rPr>
-        <w:t xml:space="preserve">Effective date: </w:t>
-      </w:r>
-      <w:r>
-        <w:t>6 September 2026</w:t>
+        <w:t>Effective date: 8 September 2026</w:t>
       </w:r>
     </w:p>
     <w:p>
@@ -96,17 +84,7 @@
         <w:pStyle w:val="Metadata"/>
       </w:pPr>
       <w:r>
-        <w:rPr>
-          <w:b/>
-        </w:rPr>
-        <w:t xml:space="preserve">Entry baseline: </w:t>
-      </w:r>
-      <w:r>
-        <w:rPr>
-          <w:rFonts w:ascii="Aptos Mono" w:hAnsi="Aptos Mono"/>
-          <w:sz w:val="17"/>
-        </w:rPr>
-        <w:t>main@0af7b14ecf0fde7e833a1db4bb36025746099137</w:t>
+        <w:t>Entry baseline: main@2ed4e4295136118711fb7dcfd7db29d0ce3a3a42</w:t>
       </w:r>
     </w:p>
     <w:p>
@@ -114,17 +92,15 @@
         <w:pStyle w:val="Metadata"/>
       </w:pPr>
       <w:r>
-        <w:rPr>
-          <w:b/>
-        </w:rPr>
-        <w:t xml:space="preserve">Production POC software: </w:t>
+        <w:t>Production POC software: 294a20ded52b7f6a3c4d689fa0de7d0b3fbe7efa</w:t>
       </w:r>
+    </w:p>
+    <w:p>
+      <w:pPr>
+        <w:pStyle w:val="Metadata"/>
+      </w:pPr>
       <w:r>
-        <w:rPr>
-          <w:rFonts w:ascii="Aptos Mono" w:hAnsi="Aptos Mono"/>
-          <w:sz w:val="17"/>
-        </w:rPr>
-        <w:t>a5e8963cde984c3e806f1a3adbc85d523211d80e</w:t>
+        <w:t>Change control: CR-2026-09-08-01</w:t>
       </w:r>
     </w:p>
     <w:p>
@@ -219,12 +195,7 @@
     </w:p>
     <w:p>
       <w:r>
-        <w:rPr>
-          <w:rFonts w:ascii="Aptos" w:hAnsi="Aptos"/>
-          <w:color w:val="1F2937"/>
-          <w:sz w:val="19"/>
-        </w:rPr>
-        <w:t>This document consolidates the valid controls from v1.1 through v2.6. It replaces serial wave execution and any later pause rule that would idle engineering solely because another lane lacks hardware, provider access, regulatory evidence or a queued human reviewer. It preserves evidence integrity, exact-SHA acceptance, commercial truth, security, independent assurance and the limited scope of prior waivers.</w:t>
+        <w:t>This document consolidates the valid controls from v1.1 through controlled revision 2.8. It replaces serial wave execution and any later pause rule that would idle engineering solely because another lane lacks hardware, provider access, regulatory evidence or a queued human reviewer. It preserves evidence integrity, exact-SHA acceptance, commercial truth, security, independent assurance and the limited scope of prior waivers.</w:t>
       </w:r>
     </w:p>
     <w:p>
@@ -530,6 +501,7 @@
           </w:tcPr>
           <w:p>
             <w:pPr>
+              <w:keepLines/>
               <w:spacing w:after="0" w:line="259" w:lineRule="auto"/>
               <w:jc w:val="center"/>
             </w:pPr>
@@ -566,6 +538,7 @@
           </w:tcPr>
           <w:p>
             <w:pPr>
+              <w:keepLines/>
               <w:spacing w:after="0" w:line="259" w:lineRule="auto"/>
               <w:jc w:val="center"/>
             </w:pPr>
@@ -602,6 +575,7 @@
           </w:tcPr>
           <w:p>
             <w:pPr>
+              <w:keepLines/>
               <w:spacing w:after="0" w:line="259" w:lineRule="auto"/>
               <w:jc w:val="center"/>
             </w:pPr>
@@ -639,6 +613,7 @@
           </w:tcPr>
           <w:p>
             <w:pPr>
+              <w:keepLines/>
               <w:spacing w:after="0" w:line="259" w:lineRule="auto"/>
               <w:jc w:val="center"/>
             </w:pPr>
@@ -672,6 +647,7 @@
           </w:tcPr>
           <w:p>
             <w:pPr>
+              <w:keepLines/>
               <w:spacing w:after="0" w:line="259" w:lineRule="auto"/>
               <w:jc w:val="left"/>
             </w:pPr>
@@ -705,6 +681,7 @@
           </w:tcPr>
           <w:p>
             <w:pPr>
+              <w:keepLines/>
               <w:spacing w:after="0" w:line="259" w:lineRule="auto"/>
               <w:jc w:val="left"/>
             </w:pPr>
@@ -741,6 +718,7 @@
           </w:tcPr>
           <w:p>
             <w:pPr>
+              <w:keepLines/>
               <w:spacing w:after="0" w:line="259" w:lineRule="auto"/>
               <w:jc w:val="center"/>
             </w:pPr>
@@ -775,6 +753,7 @@
           </w:tcPr>
           <w:p>
             <w:pPr>
+              <w:keepLines/>
               <w:spacing w:after="0" w:line="259" w:lineRule="auto"/>
               <w:jc w:val="left"/>
             </w:pPr>
@@ -809,6 +788,7 @@
           </w:tcPr>
           <w:p>
             <w:pPr>
+              <w:keepLines/>
               <w:spacing w:after="0" w:line="259" w:lineRule="auto"/>
               <w:jc w:val="left"/>
             </w:pPr>
@@ -844,6 +824,7 @@
           </w:tcPr>
           <w:p>
             <w:pPr>
+              <w:keepLines/>
               <w:spacing w:after="0" w:line="259" w:lineRule="auto"/>
               <w:jc w:val="center"/>
             </w:pPr>
@@ -877,6 +858,7 @@
           </w:tcPr>
           <w:p>
             <w:pPr>
+              <w:keepLines/>
               <w:spacing w:after="0" w:line="259" w:lineRule="auto"/>
               <w:jc w:val="left"/>
             </w:pPr>
@@ -910,6 +892,7 @@
           </w:tcPr>
           <w:p>
             <w:pPr>
+              <w:keepLines/>
               <w:spacing w:after="0" w:line="259" w:lineRule="auto"/>
               <w:jc w:val="left"/>
             </w:pPr>
@@ -946,6 +929,7 @@
           </w:tcPr>
           <w:p>
             <w:pPr>
+              <w:keepLines/>
               <w:spacing w:after="0" w:line="259" w:lineRule="auto"/>
               <w:jc w:val="center"/>
             </w:pPr>
@@ -980,6 +964,7 @@
           </w:tcPr>
           <w:p>
             <w:pPr>
+              <w:keepLines/>
               <w:spacing w:after="0" w:line="259" w:lineRule="auto"/>
               <w:jc w:val="left"/>
             </w:pPr>
@@ -1014,6 +999,7 @@
           </w:tcPr>
           <w:p>
             <w:pPr>
+              <w:keepLines/>
               <w:spacing w:after="0" w:line="259" w:lineRule="auto"/>
               <w:jc w:val="left"/>
             </w:pPr>
@@ -1049,6 +1035,7 @@
           </w:tcPr>
           <w:p>
             <w:pPr>
+              <w:keepLines/>
               <w:spacing w:after="0" w:line="259" w:lineRule="auto"/>
               <w:jc w:val="center"/>
             </w:pPr>
@@ -1082,6 +1069,7 @@
           </w:tcPr>
           <w:p>
             <w:pPr>
+              <w:keepLines/>
               <w:spacing w:after="0" w:line="259" w:lineRule="auto"/>
               <w:jc w:val="left"/>
             </w:pPr>
@@ -1115,6 +1103,7 @@
           </w:tcPr>
           <w:p>
             <w:pPr>
+              <w:keepLines/>
               <w:spacing w:after="0" w:line="259" w:lineRule="auto"/>
               <w:jc w:val="left"/>
             </w:pPr>
@@ -1151,6 +1140,7 @@
           </w:tcPr>
           <w:p>
             <w:pPr>
+              <w:keepLines/>
               <w:spacing w:after="0" w:line="259" w:lineRule="auto"/>
               <w:jc w:val="center"/>
             </w:pPr>
@@ -1185,6 +1175,7 @@
           </w:tcPr>
           <w:p>
             <w:pPr>
+              <w:keepLines/>
               <w:spacing w:after="0" w:line="259" w:lineRule="auto"/>
               <w:jc w:val="left"/>
             </w:pPr>
@@ -1219,6 +1210,7 @@
           </w:tcPr>
           <w:p>
             <w:pPr>
+              <w:keepLines/>
               <w:spacing w:after="0" w:line="259" w:lineRule="auto"/>
               <w:jc w:val="left"/>
             </w:pPr>
@@ -1255,6 +1247,7 @@
           </w:tcPr>
           <w:p>
             <w:pPr>
+              <w:keepLines/>
               <w:spacing w:after="0" w:line="259" w:lineRule="auto"/>
               <w:jc w:val="center"/>
             </w:pPr>
@@ -1288,6 +1281,7 @@
           </w:tcPr>
           <w:p>
             <w:pPr>
+              <w:keepLines/>
               <w:spacing w:after="0" w:line="259" w:lineRule="auto"/>
               <w:jc w:val="left"/>
             </w:pPr>
@@ -1321,6 +1315,7 @@
           </w:tcPr>
           <w:p>
             <w:pPr>
+              <w:keepLines/>
               <w:spacing w:after="0" w:line="259" w:lineRule="auto"/>
               <w:jc w:val="left"/>
             </w:pPr>
@@ -1409,6 +1404,7 @@
           </w:tcPr>
           <w:p>
             <w:pPr>
+              <w:keepLines/>
               <w:spacing w:after="0" w:line="259" w:lineRule="auto"/>
               <w:jc w:val="center"/>
             </w:pPr>
@@ -1445,6 +1441,7 @@
           </w:tcPr>
           <w:p>
             <w:pPr>
+              <w:keepLines/>
               <w:spacing w:after="0" w:line="259" w:lineRule="auto"/>
               <w:jc w:val="center"/>
             </w:pPr>
@@ -1481,6 +1478,7 @@
           </w:tcPr>
           <w:p>
             <w:pPr>
+              <w:keepLines/>
               <w:spacing w:after="0" w:line="259" w:lineRule="auto"/>
               <w:jc w:val="center"/>
             </w:pPr>
@@ -1518,6 +1516,7 @@
           </w:tcPr>
           <w:p>
             <w:pPr>
+              <w:keepLines/>
               <w:spacing w:after="0" w:line="259" w:lineRule="auto"/>
               <w:jc w:val="center"/>
             </w:pPr>
@@ -1551,6 +1550,7 @@
           </w:tcPr>
           <w:p>
             <w:pPr>
+              <w:keepLines/>
               <w:spacing w:after="0" w:line="259" w:lineRule="auto"/>
               <w:jc w:val="left"/>
             </w:pPr>
@@ -1584,6 +1584,7 @@
           </w:tcPr>
           <w:p>
             <w:pPr>
+              <w:keepLines/>
               <w:spacing w:after="0" w:line="259" w:lineRule="auto"/>
               <w:jc w:val="left"/>
             </w:pPr>
@@ -1620,6 +1621,7 @@
           </w:tcPr>
           <w:p>
             <w:pPr>
+              <w:keepLines/>
               <w:spacing w:after="0" w:line="259" w:lineRule="auto"/>
               <w:jc w:val="center"/>
             </w:pPr>
@@ -1654,6 +1656,7 @@
           </w:tcPr>
           <w:p>
             <w:pPr>
+              <w:keepLines/>
               <w:spacing w:after="0" w:line="259" w:lineRule="auto"/>
               <w:jc w:val="left"/>
             </w:pPr>
@@ -1688,6 +1691,7 @@
           </w:tcPr>
           <w:p>
             <w:pPr>
+              <w:keepLines/>
               <w:spacing w:after="0" w:line="259" w:lineRule="auto"/>
               <w:jc w:val="left"/>
             </w:pPr>
@@ -1723,6 +1727,7 @@
           </w:tcPr>
           <w:p>
             <w:pPr>
+              <w:keepLines/>
               <w:spacing w:after="0" w:line="259" w:lineRule="auto"/>
               <w:jc w:val="center"/>
             </w:pPr>
@@ -1756,6 +1761,7 @@
           </w:tcPr>
           <w:p>
             <w:pPr>
+              <w:keepLines/>
               <w:spacing w:after="0" w:line="259" w:lineRule="auto"/>
               <w:jc w:val="left"/>
             </w:pPr>
@@ -1789,6 +1795,7 @@
           </w:tcPr>
           <w:p>
             <w:pPr>
+              <w:keepLines/>
               <w:spacing w:after="0" w:line="259" w:lineRule="auto"/>
               <w:jc w:val="left"/>
             </w:pPr>
@@ -1826,6 +1833,7 @@
           </w:tcPr>
           <w:p>
             <w:pPr>
+              <w:keepLines/>
               <w:spacing w:after="0" w:line="259" w:lineRule="auto"/>
               <w:jc w:val="center"/>
             </w:pPr>
@@ -1860,6 +1868,7 @@
           </w:tcPr>
           <w:p>
             <w:pPr>
+              <w:keepLines/>
               <w:spacing w:after="0" w:line="259" w:lineRule="auto"/>
               <w:jc w:val="left"/>
             </w:pPr>
@@ -1894,6 +1903,7 @@
           </w:tcPr>
           <w:p>
             <w:pPr>
+              <w:keepLines/>
               <w:spacing w:after="0" w:line="259" w:lineRule="auto"/>
               <w:jc w:val="left"/>
             </w:pPr>
@@ -2094,6 +2104,14 @@
       </w:r>
     </w:p>
     <w:p>
+      <w:pPr>
+        <w:pStyle w:val="ListBullet"/>
+      </w:pPr>
+      <w:r>
+        <w:t>Interface Efficiency: shared shell, information priority, page density, responsive structure, accessible controls, tables, and truthful loading, empty, stale and error states.</w:t>
+      </w:r>
+    </w:p>
+    <w:p>
       <w:r>
         <w:rPr>
           <w:rFonts w:ascii="Aptos" w:hAnsi="Aptos"/>
@@ -2108,12 +2126,99 @@
         <w:pStyle w:val="Heading1"/>
       </w:pPr>
       <w:r>
-        <w:rPr>
-          <w:rFonts w:ascii="Aptos" w:hAnsi="Aptos"/>
-          <w:color w:val="1F2937"/>
-          <w:sz w:val="19"/>
-        </w:rPr>
-        <w:t>8. Software completion and hardware boundary</w:t>
+        <w:t>8. Interface density and information priority standard</w:t>
+      </w:r>
+    </w:p>
+    <w:p>
+      <w:pPr/>
+      <w:r>
+        <w:t>OpsTrax is an operating product. Each page must maximize useful decision information without obscuring hierarchy, accessibility or commercial truth. This standard applies to all existing modules and every new or changed vertical slice.</w:t>
+      </w:r>
+    </w:p>
+    <w:p>
+      <w:pPr>
+        <w:pStyle w:val="ListBullet"/>
+      </w:pPr>
+      <w:r>
+        <w:t>Put the page's primary status, exception or task and its most likely action above the fold on a standard 1366 by 768 desktop viewport wherever the content permits.</w:t>
+      </w:r>
+    </w:p>
+    <w:p>
+      <w:pPr>
+        <w:pStyle w:val="ListBullet"/>
+      </w:pPr>
+      <w:r>
+        <w:t>Keep the global header, breadcrumbs, quick access and navigation compact. They must orient the user without consuming the working area needed for fleet, safety, device, sensor and compliance decisions.</w:t>
+      </w:r>
+    </w:p>
+    <w:p>
+      <w:pPr>
+        <w:pStyle w:val="ListBullet"/>
+      </w:pPr>
+      <w:r>
+        <w:t>Use one clear page heading. Keep supporting explanations concise and place secondary guidance beside or below the work it explains.</w:t>
+      </w:r>
+    </w:p>
+    <w:p>
+      <w:pPr>
+        <w:pStyle w:val="ListBullet"/>
+      </w:pPr>
+      <w:r>
+        <w:t>Size visible buttons for their action and label. Preserve accessible focus, target size and spacing without using large padded controls that displace operational content.</w:t>
+      </w:r>
+    </w:p>
+    <w:p>
+      <w:pPr>
+        <w:pStyle w:val="ListBullet"/>
+      </w:pPr>
+      <w:r>
+        <w:t>Use dense, readable KPI strips, filters, tables and split views for frequently scanned information. Give more space only to maps, media, complex forms or analysis that needs it.</w:t>
+      </w:r>
+    </w:p>
+    <w:p>
+      <w:pPr>
+        <w:pStyle w:val="ListBullet"/>
+      </w:pPr>
+      <w:r>
+        <w:t>Keep empty, loading, unavailable and error states proportional to their message. They must explain the truthful state and recovery action without expanding a small message into an otherwise empty full-screen panel.</w:t>
+      </w:r>
+    </w:p>
+    <w:p>
+      <w:pPr>
+        <w:pStyle w:val="ListBullet"/>
+      </w:pPr>
+      <w:r>
+        <w:t>Make responsive behavior structural. Reflow, collapse or progressively disclose secondary content at narrow widths while keeping DOM order, keyboard order and visual order aligned.</w:t>
+      </w:r>
+    </w:p>
+    <w:p>
+      <w:pPr>
+        <w:pStyle w:val="ListBullet"/>
+      </w:pPr>
+      <w:r>
+        <w:t>Prefer shared shell, token and primitive improvements that raise the quality of every module. Add page-specific layout only where the task and information hierarchy require it.</w:t>
+      </w:r>
+    </w:p>
+    <w:p>
+      <w:pPr>
+        <w:pStyle w:val="ListBullet"/>
+      </w:pPr>
+      <w:r>
+        <w:t>Review realistic long labels, large row counts, zero-data states, API failures, stale/offline states, browser zoom and desktop and handheld widths.</w:t>
+      </w:r>
+    </w:p>
+    <w:p>
+      <w:pPr/>
+      <w:r>
+        <w:t>During BUILD, the owning squad records the page's primary task path and checks the changed responsive states. During INTEGRATE, UX and independent SDET verify shared-shell regressions, keyboard behavior, density and information visibility. During CERTIFY, visible browser evidence on the frozen exact SHA confirms that critical status and actions remain understandable with persisted customer-scale data. A density defect that materially hides or obstructs a core workflow is P2 or P1 according to its operational effect; a cosmetic spacing issue is P3.</w:t>
+      </w:r>
+    </w:p>
+    <w:p>
+      <w:pPr>
+        <w:pStyle w:val="Heading1"/>
+      </w:pPr>
+      <w:r>
+        <w:t>9. Software completion and hardware boundary</w:t>
       </w:r>
     </w:p>
     <w:p>
@@ -2353,12 +2458,7 @@
         <w:pStyle w:val="Heading1"/>
       </w:pPr>
       <w:r>
-        <w:rPr>
-          <w:rFonts w:ascii="Aptos" w:hAnsi="Aptos"/>
-          <w:color w:val="1F2937"/>
-          <w:sz w:val="19"/>
-        </w:rPr>
-        <w:t>9. Evidence rules by speed</w:t>
+        <w:t>10. Evidence rules by speed</w:t>
       </w:r>
     </w:p>
     <w:tbl>
@@ -2400,6 +2500,7 @@
           </w:tcPr>
           <w:p>
             <w:pPr>
+              <w:keepLines/>
               <w:spacing w:after="0" w:line="259" w:lineRule="auto"/>
               <w:jc w:val="left"/>
             </w:pPr>
@@ -2436,6 +2537,7 @@
           </w:tcPr>
           <w:p>
             <w:pPr>
+              <w:keepLines/>
               <w:spacing w:after="0" w:line="259" w:lineRule="auto"/>
               <w:jc w:val="left"/>
             </w:pPr>
@@ -2472,6 +2574,7 @@
           </w:tcPr>
           <w:p>
             <w:pPr>
+              <w:keepLines/>
               <w:spacing w:after="0" w:line="259" w:lineRule="auto"/>
               <w:jc w:val="left"/>
             </w:pPr>
@@ -2508,6 +2611,7 @@
           </w:tcPr>
           <w:p>
             <w:pPr>
+              <w:keepLines/>
               <w:spacing w:after="0" w:line="259" w:lineRule="auto"/>
               <w:jc w:val="left"/>
             </w:pPr>
@@ -2545,6 +2649,7 @@
           </w:tcPr>
           <w:p>
             <w:pPr>
+              <w:keepLines/>
               <w:spacing w:after="0" w:line="259" w:lineRule="auto"/>
               <w:jc w:val="left"/>
             </w:pPr>
@@ -2578,6 +2683,7 @@
           </w:tcPr>
           <w:p>
             <w:pPr>
+              <w:keepLines/>
               <w:spacing w:after="0" w:line="259" w:lineRule="auto"/>
               <w:jc w:val="left"/>
             </w:pPr>
@@ -2611,6 +2717,7 @@
           </w:tcPr>
           <w:p>
             <w:pPr>
+              <w:keepLines/>
               <w:spacing w:after="0" w:line="259" w:lineRule="auto"/>
               <w:jc w:val="left"/>
             </w:pPr>
@@ -2644,6 +2751,7 @@
           </w:tcPr>
           <w:p>
             <w:pPr>
+              <w:keepLines/>
               <w:spacing w:after="0" w:line="259" w:lineRule="auto"/>
               <w:jc w:val="left"/>
             </w:pPr>
@@ -2680,6 +2788,7 @@
           </w:tcPr>
           <w:p>
             <w:pPr>
+              <w:keepLines/>
               <w:spacing w:after="0" w:line="259" w:lineRule="auto"/>
               <w:jc w:val="left"/>
             </w:pPr>
@@ -2714,6 +2823,7 @@
           </w:tcPr>
           <w:p>
             <w:pPr>
+              <w:keepLines/>
               <w:spacing w:after="0" w:line="259" w:lineRule="auto"/>
               <w:jc w:val="left"/>
             </w:pPr>
@@ -2748,6 +2858,7 @@
           </w:tcPr>
           <w:p>
             <w:pPr>
+              <w:keepLines/>
               <w:spacing w:after="0" w:line="259" w:lineRule="auto"/>
               <w:jc w:val="left"/>
             </w:pPr>
@@ -2782,6 +2893,7 @@
           </w:tcPr>
           <w:p>
             <w:pPr>
+              <w:keepLines/>
               <w:spacing w:after="0" w:line="259" w:lineRule="auto"/>
               <w:jc w:val="left"/>
             </w:pPr>
@@ -2817,6 +2929,7 @@
           </w:tcPr>
           <w:p>
             <w:pPr>
+              <w:keepLines/>
               <w:spacing w:after="0" w:line="259" w:lineRule="auto"/>
               <w:jc w:val="left"/>
             </w:pPr>
@@ -2850,6 +2963,7 @@
           </w:tcPr>
           <w:p>
             <w:pPr>
+              <w:keepLines/>
               <w:spacing w:after="0" w:line="259" w:lineRule="auto"/>
               <w:jc w:val="left"/>
             </w:pPr>
@@ -2883,6 +2997,7 @@
           </w:tcPr>
           <w:p>
             <w:pPr>
+              <w:keepLines/>
               <w:spacing w:after="0" w:line="259" w:lineRule="auto"/>
               <w:jc w:val="left"/>
             </w:pPr>
@@ -2916,6 +3031,7 @@
           </w:tcPr>
           <w:p>
             <w:pPr>
+              <w:keepLines/>
               <w:spacing w:after="0" w:line="259" w:lineRule="auto"/>
               <w:jc w:val="left"/>
             </w:pPr>
@@ -2952,6 +3068,7 @@
           </w:tcPr>
           <w:p>
             <w:pPr>
+              <w:keepLines/>
               <w:spacing w:after="0" w:line="259" w:lineRule="auto"/>
               <w:jc w:val="left"/>
             </w:pPr>
@@ -2986,6 +3103,7 @@
           </w:tcPr>
           <w:p>
             <w:pPr>
+              <w:keepLines/>
               <w:spacing w:after="0" w:line="259" w:lineRule="auto"/>
               <w:jc w:val="left"/>
             </w:pPr>
@@ -3020,6 +3138,7 @@
           </w:tcPr>
           <w:p>
             <w:pPr>
+              <w:keepLines/>
               <w:spacing w:after="0" w:line="259" w:lineRule="auto"/>
               <w:jc w:val="left"/>
             </w:pPr>
@@ -3054,6 +3173,7 @@
           </w:tcPr>
           <w:p>
             <w:pPr>
+              <w:keepLines/>
               <w:spacing w:after="0" w:line="259" w:lineRule="auto"/>
               <w:jc w:val="left"/>
             </w:pPr>
@@ -3089,6 +3209,7 @@
           </w:tcPr>
           <w:p>
             <w:pPr>
+              <w:keepLines/>
               <w:spacing w:after="0" w:line="259" w:lineRule="auto"/>
               <w:jc w:val="left"/>
             </w:pPr>
@@ -3122,6 +3243,7 @@
           </w:tcPr>
           <w:p>
             <w:pPr>
+              <w:keepLines/>
               <w:spacing w:after="0" w:line="259" w:lineRule="auto"/>
               <w:jc w:val="left"/>
             </w:pPr>
@@ -3155,6 +3277,7 @@
           </w:tcPr>
           <w:p>
             <w:pPr>
+              <w:keepLines/>
               <w:spacing w:after="0" w:line="259" w:lineRule="auto"/>
               <w:jc w:val="left"/>
             </w:pPr>
@@ -3188,6 +3311,7 @@
           </w:tcPr>
           <w:p>
             <w:pPr>
+              <w:keepLines/>
               <w:spacing w:after="0" w:line="259" w:lineRule="auto"/>
               <w:jc w:val="left"/>
             </w:pPr>
@@ -3224,6 +3348,7 @@
           </w:tcPr>
           <w:p>
             <w:pPr>
+              <w:keepLines/>
               <w:spacing w:after="0" w:line="259" w:lineRule="auto"/>
               <w:jc w:val="left"/>
             </w:pPr>
@@ -3258,6 +3383,7 @@
           </w:tcPr>
           <w:p>
             <w:pPr>
+              <w:keepLines/>
               <w:spacing w:after="0" w:line="259" w:lineRule="auto"/>
               <w:jc w:val="left"/>
             </w:pPr>
@@ -3292,6 +3418,7 @@
           </w:tcPr>
           <w:p>
             <w:pPr>
+              <w:keepLines/>
               <w:spacing w:after="0" w:line="259" w:lineRule="auto"/>
               <w:jc w:val="left"/>
             </w:pPr>
@@ -3326,6 +3453,7 @@
           </w:tcPr>
           <w:p>
             <w:pPr>
+              <w:keepLines/>
               <w:spacing w:after="0" w:line="259" w:lineRule="auto"/>
               <w:jc w:val="left"/>
             </w:pPr>
@@ -3350,6 +3478,60 @@
       <w:tr>
         <w:tc>
           <w:tcPr>
+            <w:tcW w:type="dxa" w:w="2541"/>
+          </w:tcPr>
+          <w:p>
+            <w:pPr>
+              <w:keepLines/>
+            </w:pPr>
+            <w:r>
+              <w:t>Information priority, density and responsive states</w:t>
+            </w:r>
+          </w:p>
+        </w:tc>
+        <w:tc>
+          <w:tcPr>
+            <w:tcW w:type="dxa" w:w="2541"/>
+          </w:tcPr>
+          <w:p>
+            <w:pPr>
+              <w:keepLines/>
+            </w:pPr>
+            <w:r>
+              <w:t>Changed-page review</w:t>
+            </w:r>
+          </w:p>
+        </w:tc>
+        <w:tc>
+          <w:tcPr>
+            <w:tcW w:type="dxa" w:w="2541"/>
+          </w:tcPr>
+          <w:p>
+            <w:pPr>
+              <w:keepLines/>
+            </w:pPr>
+            <w:r>
+              <w:t>Shared-shell and representative-route review</w:t>
+            </w:r>
+          </w:p>
+        </w:tc>
+        <w:tc>
+          <w:tcPr>
+            <w:tcW w:type="dxa" w:w="2541"/>
+          </w:tcPr>
+          <w:p>
+            <w:pPr>
+              <w:keepLines/>
+            </w:pPr>
+            <w:r>
+              <w:t>Required for affected customer-facing claims</w:t>
+            </w:r>
+          </w:p>
+        </w:tc>
+      </w:tr>
+      <w:tr>
+        <w:tc>
+          <w:tcPr>
             <w:tcW w:type="dxa" w:w="1872"/>
             <w:vAlign w:val="center"/>
             <w:tcMar>
@@ -3361,6 +3543,7 @@
           </w:tcPr>
           <w:p>
             <w:pPr>
+              <w:keepLines/>
               <w:spacing w:after="0" w:line="259" w:lineRule="auto"/>
               <w:jc w:val="left"/>
             </w:pPr>
@@ -3394,6 +3577,7 @@
           </w:tcPr>
           <w:p>
             <w:pPr>
+              <w:keepLines/>
               <w:spacing w:after="0" w:line="259" w:lineRule="auto"/>
               <w:jc w:val="left"/>
             </w:pPr>
@@ -3427,6 +3611,7 @@
           </w:tcPr>
           <w:p>
             <w:pPr>
+              <w:keepLines/>
               <w:spacing w:after="0" w:line="259" w:lineRule="auto"/>
               <w:jc w:val="left"/>
             </w:pPr>
@@ -3460,6 +3645,7 @@
           </w:tcPr>
           <w:p>
             <w:pPr>
+              <w:keepLines/>
               <w:spacing w:after="0" w:line="259" w:lineRule="auto"/>
               <w:jc w:val="left"/>
             </w:pPr>
@@ -3496,6 +3682,7 @@
           </w:tcPr>
           <w:p>
             <w:pPr>
+              <w:keepLines/>
               <w:spacing w:after="0" w:line="259" w:lineRule="auto"/>
               <w:jc w:val="left"/>
             </w:pPr>
@@ -3530,6 +3717,7 @@
           </w:tcPr>
           <w:p>
             <w:pPr>
+              <w:keepLines/>
               <w:spacing w:after="0" w:line="259" w:lineRule="auto"/>
               <w:jc w:val="left"/>
             </w:pPr>
@@ -3564,6 +3752,7 @@
           </w:tcPr>
           <w:p>
             <w:pPr>
+              <w:keepLines/>
               <w:spacing w:after="0" w:line="259" w:lineRule="auto"/>
               <w:jc w:val="left"/>
             </w:pPr>
@@ -3598,6 +3787,7 @@
           </w:tcPr>
           <w:p>
             <w:pPr>
+              <w:keepLines/>
               <w:spacing w:after="0" w:line="259" w:lineRule="auto"/>
               <w:jc w:val="left"/>
             </w:pPr>
@@ -3633,6 +3823,7 @@
           </w:tcPr>
           <w:p>
             <w:pPr>
+              <w:keepLines/>
               <w:spacing w:after="0" w:line="259" w:lineRule="auto"/>
               <w:jc w:val="left"/>
             </w:pPr>
@@ -3666,6 +3857,7 @@
           </w:tcPr>
           <w:p>
             <w:pPr>
+              <w:keepLines/>
               <w:spacing w:after="0" w:line="259" w:lineRule="auto"/>
               <w:jc w:val="left"/>
             </w:pPr>
@@ -3699,6 +3891,7 @@
           </w:tcPr>
           <w:p>
             <w:pPr>
+              <w:keepLines/>
               <w:spacing w:after="0" w:line="259" w:lineRule="auto"/>
               <w:jc w:val="left"/>
             </w:pPr>
@@ -3732,6 +3925,7 @@
           </w:tcPr>
           <w:p>
             <w:pPr>
+              <w:keepLines/>
               <w:spacing w:after="0" w:line="259" w:lineRule="auto"/>
               <w:jc w:val="left"/>
             </w:pPr>
@@ -3769,6 +3963,7 @@
           </w:tcPr>
           <w:p>
             <w:pPr>
+              <w:keepLines/>
               <w:spacing w:after="0" w:line="259" w:lineRule="auto"/>
               <w:jc w:val="left"/>
             </w:pPr>
@@ -3803,6 +3998,7 @@
           </w:tcPr>
           <w:p>
             <w:pPr>
+              <w:keepLines/>
               <w:spacing w:after="0" w:line="259" w:lineRule="auto"/>
               <w:jc w:val="left"/>
             </w:pPr>
@@ -3837,6 +4033,7 @@
           </w:tcPr>
           <w:p>
             <w:pPr>
+              <w:keepLines/>
               <w:spacing w:after="0" w:line="259" w:lineRule="auto"/>
               <w:jc w:val="left"/>
             </w:pPr>
@@ -3871,6 +4068,7 @@
           </w:tcPr>
           <w:p>
             <w:pPr>
+              <w:keepLines/>
               <w:spacing w:after="0" w:line="259" w:lineRule="auto"/>
               <w:jc w:val="left"/>
             </w:pPr>
@@ -3913,12 +4111,7 @@
         <w:pStyle w:val="Heading1"/>
       </w:pPr>
       <w:r>
-        <w:rPr>
-          <w:rFonts w:ascii="Aptos" w:hAnsi="Aptos"/>
-          <w:color w:val="1F2937"/>
-          <w:sz w:val="19"/>
-        </w:rPr>
-        <w:t>10. Integration gate</w:t>
+        <w:t>11. Integration gate</w:t>
       </w:r>
     </w:p>
     <w:p>
@@ -4057,18 +4250,7 @@
         <w:ind w:left="317" w:hanging="317"/>
       </w:pPr>
       <w:r>
-        <w:rPr>
-          <w:b/>
-        </w:rPr>
-        <w:t xml:space="preserve">7.  </w:t>
-      </w:r>
-      <w:r>
-        <w:rPr>
-          <w:rFonts w:ascii="Aptos" w:hAnsi="Aptos"/>
-          <w:color w:val="1F2937"/>
-          <w:sz w:val="19"/>
-        </w:rPr>
-        <w:t>Frontend contracts, build and bundle budget.</w:t>
+        <w:t>7.  Frontend contracts, build, bundle budget, shared-shell density, representative desktop and narrow layouts, and truthful loading/empty/error states.</w:t>
       </w:r>
     </w:p>
     <w:p>
@@ -4196,12 +4378,7 @@
         <w:pStyle w:val="Heading1"/>
       </w:pPr>
       <w:r>
-        <w:rPr>
-          <w:rFonts w:ascii="Aptos" w:hAnsi="Aptos"/>
-          <w:color w:val="1F2937"/>
-          <w:sz w:val="19"/>
-        </w:rPr>
-        <w:t>11. Certification gate</w:t>
+        <w:t>12. Certification gate</w:t>
       </w:r>
     </w:p>
     <w:p>
@@ -4216,12 +4393,7 @@
     </w:p>
     <w:p>
       <w:r>
-        <w:rPr>
-          <w:rFonts w:ascii="Aptos" w:hAnsi="Aptos"/>
-          <w:color w:val="1F2937"/>
-          <w:sz w:val="19"/>
-        </w:rPr>
-        <w:t>Customer-facing acceptance requires visible Chrome on the intended POC or release surface, persisted data, refresh and sign-out/sign-in survival, role and branch boundaries, and truthful empty/stale/offline/error states. Demo data must be clearly labelled and cannot serve as customer, provider, hardware, video or regulatory evidence.</w:t>
+        <w:t>Customer-facing acceptance requires visible Chrome on the intended POC or release surface, persisted data, refresh and sign-out/sign-in survival, role and branch boundaries, efficient information priority at desktop and narrow widths, and truthful empty/stale/offline/error states. Demo data must be clearly labelled and cannot serve as customer, provider, hardware, video or regulatory evidence.</w:t>
       </w:r>
     </w:p>
     <w:p>
@@ -4254,22 +4426,12 @@
         <w:pStyle w:val="Heading1"/>
       </w:pPr>
       <w:r>
-        <w:rPr>
-          <w:rFonts w:ascii="Aptos" w:hAnsi="Aptos"/>
-          <w:color w:val="1F2937"/>
-          <w:sz w:val="19"/>
-        </w:rPr>
-        <w:t>12. Current repository and production truth</w:t>
+        <w:t>13. Current repository and production truth</w:t>
       </w:r>
     </w:p>
     <w:p>
       <w:r>
-        <w:rPr>
-          <w:rFonts w:ascii="Aptos" w:hAnsi="Aptos"/>
-          <w:color w:val="1F2937"/>
-          <w:sz w:val="19"/>
-        </w:rPr>
-        <w:t>Live GitHub state was verified on 2026-09-06.</w:t>
+        <w:t>Live GitHub and production state was verified on 2026-09-08.</w:t>
       </w:r>
     </w:p>
     <w:p>
@@ -4277,44 +4439,7 @@
         <w:pStyle w:val="ListBullet"/>
       </w:pPr>
       <w:r>
-        <w:rPr>
-          <w:rFonts w:ascii="Aptos" w:hAnsi="Aptos"/>
-          <w:color w:val="1F2937"/>
-          <w:sz w:val="19"/>
-        </w:rPr>
-        <w:t xml:space="preserve">Current </w:t>
-      </w:r>
-      <w:r>
-        <w:rPr>
-          <w:rFonts w:ascii="Aptos Mono" w:hAnsi="Aptos Mono"/>
-          <w:color w:val="2F5597"/>
-          <w:sz w:val="17"/>
-        </w:rPr>
-        <w:t>main</w:t>
-      </w:r>
-      <w:r>
-        <w:rPr>
-          <w:rFonts w:ascii="Aptos" w:hAnsi="Aptos"/>
-          <w:color w:val="1F2937"/>
-          <w:sz w:val="19"/>
-        </w:rPr>
-        <w:t xml:space="preserve"> is </w:t>
-      </w:r>
-      <w:r>
-        <w:rPr>
-          <w:rFonts w:ascii="Aptos Mono" w:hAnsi="Aptos Mono"/>
-          <w:color w:val="2F5597"/>
-          <w:sz w:val="17"/>
-        </w:rPr>
-        <w:t>0af7b14ecf0fde7e833a1db4bb36025746099137</w:t>
-      </w:r>
-      <w:r>
-        <w:rPr>
-          <w:rFonts w:ascii="Aptos" w:hAnsi="Aptos"/>
-          <w:color w:val="1F2937"/>
-          <w:sz w:val="19"/>
-        </w:rPr>
-        <w:t>.</w:t>
+        <w:t>Current main is 2ed4e4295136118711fb7dcfd7db29d0ce3a3a42.</w:t>
       </w:r>
     </w:p>
     <w:p>
@@ -4322,28 +4447,7 @@
         <w:pStyle w:val="ListBullet"/>
       </w:pPr>
       <w:r>
-        <w:rPr>
-          <w:rFonts w:ascii="Aptos" w:hAnsi="Aptos"/>
-          <w:color w:val="1F2937"/>
-          <w:sz w:val="19"/>
-        </w:rPr>
-        <w:t xml:space="preserve">The production POC frontend and API report exact deployed software SHA </w:t>
-      </w:r>
-      <w:r>
-        <w:rPr>
-          <w:rFonts w:ascii="Aptos Mono" w:hAnsi="Aptos Mono"/>
-          <w:color w:val="2F5597"/>
-          <w:sz w:val="17"/>
-        </w:rPr>
-        <w:t>a5e8963cde984c3e806f1a3adbc85d523211d80e</w:t>
-      </w:r>
-      <w:r>
-        <w:rPr>
-          <w:rFonts w:ascii="Aptos" w:hAnsi="Aptos"/>
-          <w:color w:val="1F2937"/>
-          <w:sz w:val="19"/>
-        </w:rPr>
-        <w:t>.</w:t>
+        <w:t>The production POC frontend and API report exact deployed software SHA 294a20ded52b7f6a3c4d689fa0de7d0b3fbe7efa.</w:t>
       </w:r>
     </w:p>
     <w:p>
@@ -4438,6 +4542,22 @@
       </w:r>
     </w:p>
     <w:p>
+      <w:pPr>
+        <w:pStyle w:val="ListBullet"/>
+      </w:pPr>
+      <w:r>
+        <w:t>Authenticated Firefox review on 2026-09-08 showed the Camera Metadata page unable to load records, Fleet Overview unable to reach the vehicle service, and Telematics Control Tower receiving HTTP 401. These are unresolved production POC acceptance failures; repository health does not override them.</w:t>
+      </w:r>
+    </w:p>
+    <w:p>
+      <w:pPr>
+        <w:pStyle w:val="ListBullet"/>
+      </w:pPr>
+      <w:r>
+        <w:t>The current hardening branch contains later software corrections and UI-density work that remain unpublished until a new integration candidate is frozen and authorized.</w:t>
+      </w:r>
+    </w:p>
+    <w:p>
       <w:r>
         <w:rPr>
           <w:rFonts w:ascii="Aptos" w:hAnsi="Aptos"/>
@@ -4452,12 +4572,7 @@
         <w:pStyle w:val="Heading1"/>
       </w:pPr>
       <w:r>
-        <w:rPr>
-          <w:rFonts w:ascii="Aptos" w:hAnsi="Aptos"/>
-          <w:color w:val="1F2937"/>
-          <w:sz w:val="19"/>
-        </w:rPr>
-        <w:t>13. Current vertical-slice board</w:t>
+        <w:t>14. Current vertical-slice board</w:t>
       </w:r>
     </w:p>
     <w:tbl>
@@ -4499,6 +4614,7 @@
           </w:tcPr>
           <w:p>
             <w:pPr>
+              <w:keepLines/>
               <w:spacing w:after="0" w:line="259" w:lineRule="auto"/>
               <w:jc w:val="left"/>
             </w:pPr>
@@ -4535,6 +4651,7 @@
           </w:tcPr>
           <w:p>
             <w:pPr>
+              <w:keepLines/>
               <w:spacing w:after="0" w:line="259" w:lineRule="auto"/>
               <w:jc w:val="left"/>
             </w:pPr>
@@ -4571,6 +4688,7 @@
           </w:tcPr>
           <w:p>
             <w:pPr>
+              <w:keepLines/>
               <w:spacing w:after="0" w:line="259" w:lineRule="auto"/>
               <w:jc w:val="left"/>
             </w:pPr>
@@ -4607,6 +4725,7 @@
           </w:tcPr>
           <w:p>
             <w:pPr>
+              <w:keepLines/>
               <w:spacing w:after="0" w:line="259" w:lineRule="auto"/>
               <w:jc w:val="left"/>
             </w:pPr>
@@ -4644,6 +4763,7 @@
           </w:tcPr>
           <w:p>
             <w:pPr>
+              <w:keepLines/>
               <w:spacing w:after="0" w:line="259" w:lineRule="auto"/>
               <w:jc w:val="left"/>
             </w:pPr>
@@ -4677,6 +4797,7 @@
           </w:tcPr>
           <w:p>
             <w:pPr>
+              <w:keepLines/>
               <w:spacing w:after="0" w:line="259" w:lineRule="auto"/>
               <w:jc w:val="left"/>
             </w:pPr>
@@ -4710,6 +4831,7 @@
           </w:tcPr>
           <w:p>
             <w:pPr>
+              <w:keepLines/>
               <w:spacing w:after="0" w:line="259" w:lineRule="auto"/>
               <w:jc w:val="left"/>
             </w:pPr>
@@ -4743,6 +4865,7 @@
           </w:tcPr>
           <w:p>
             <w:pPr>
+              <w:keepLines/>
               <w:spacing w:after="0" w:line="259" w:lineRule="auto"/>
               <w:jc w:val="left"/>
             </w:pPr>
@@ -4779,6 +4902,7 @@
           </w:tcPr>
           <w:p>
             <w:pPr>
+              <w:keepLines/>
               <w:spacing w:after="0" w:line="259" w:lineRule="auto"/>
               <w:jc w:val="left"/>
             </w:pPr>
@@ -4813,6 +4937,7 @@
           </w:tcPr>
           <w:p>
             <w:pPr>
+              <w:keepLines/>
               <w:spacing w:after="0" w:line="259" w:lineRule="auto"/>
               <w:jc w:val="left"/>
             </w:pPr>
@@ -4847,6 +4972,7 @@
           </w:tcPr>
           <w:p>
             <w:pPr>
+              <w:keepLines/>
               <w:spacing w:after="0" w:line="259" w:lineRule="auto"/>
               <w:jc w:val="left"/>
             </w:pPr>
@@ -4881,6 +5007,7 @@
           </w:tcPr>
           <w:p>
             <w:pPr>
+              <w:keepLines/>
               <w:spacing w:after="0" w:line="259" w:lineRule="auto"/>
               <w:jc w:val="left"/>
             </w:pPr>
@@ -4916,6 +5043,7 @@
           </w:tcPr>
           <w:p>
             <w:pPr>
+              <w:keepLines/>
               <w:spacing w:after="0" w:line="259" w:lineRule="auto"/>
               <w:jc w:val="left"/>
             </w:pPr>
@@ -4949,6 +5077,7 @@
           </w:tcPr>
           <w:p>
             <w:pPr>
+              <w:keepLines/>
               <w:spacing w:after="0" w:line="259" w:lineRule="auto"/>
               <w:jc w:val="left"/>
             </w:pPr>
@@ -4982,6 +5111,7 @@
           </w:tcPr>
           <w:p>
             <w:pPr>
+              <w:keepLines/>
               <w:spacing w:after="0" w:line="259" w:lineRule="auto"/>
               <w:jc w:val="left"/>
             </w:pPr>
@@ -5015,6 +5145,7 @@
           </w:tcPr>
           <w:p>
             <w:pPr>
+              <w:keepLines/>
               <w:spacing w:after="0" w:line="259" w:lineRule="auto"/>
               <w:jc w:val="left"/>
             </w:pPr>
@@ -5051,6 +5182,7 @@
           </w:tcPr>
           <w:p>
             <w:pPr>
+              <w:keepLines/>
               <w:spacing w:after="0" w:line="259" w:lineRule="auto"/>
               <w:jc w:val="left"/>
             </w:pPr>
@@ -5085,6 +5217,7 @@
           </w:tcPr>
           <w:p>
             <w:pPr>
+              <w:keepLines/>
               <w:spacing w:after="0" w:line="259" w:lineRule="auto"/>
               <w:jc w:val="left"/>
             </w:pPr>
@@ -5119,6 +5252,7 @@
           </w:tcPr>
           <w:p>
             <w:pPr>
+              <w:keepLines/>
               <w:spacing w:after="0" w:line="259" w:lineRule="auto"/>
               <w:jc w:val="left"/>
             </w:pPr>
@@ -5153,6 +5287,7 @@
           </w:tcPr>
           <w:p>
             <w:pPr>
+              <w:keepLines/>
               <w:spacing w:after="0" w:line="259" w:lineRule="auto"/>
               <w:jc w:val="left"/>
             </w:pPr>
@@ -5188,6 +5323,7 @@
           </w:tcPr>
           <w:p>
             <w:pPr>
+              <w:keepLines/>
               <w:spacing w:after="0" w:line="259" w:lineRule="auto"/>
               <w:jc w:val="left"/>
             </w:pPr>
@@ -5221,6 +5357,7 @@
           </w:tcPr>
           <w:p>
             <w:pPr>
+              <w:keepLines/>
               <w:spacing w:after="0" w:line="259" w:lineRule="auto"/>
               <w:jc w:val="left"/>
             </w:pPr>
@@ -5254,6 +5391,7 @@
           </w:tcPr>
           <w:p>
             <w:pPr>
+              <w:keepLines/>
               <w:spacing w:after="0" w:line="259" w:lineRule="auto"/>
               <w:jc w:val="left"/>
             </w:pPr>
@@ -5287,6 +5425,7 @@
           </w:tcPr>
           <w:p>
             <w:pPr>
+              <w:keepLines/>
               <w:spacing w:after="0" w:line="259" w:lineRule="auto"/>
               <w:jc w:val="left"/>
             </w:pPr>
@@ -5323,6 +5462,7 @@
           </w:tcPr>
           <w:p>
             <w:pPr>
+              <w:keepLines/>
               <w:spacing w:after="0" w:line="259" w:lineRule="auto"/>
               <w:jc w:val="left"/>
             </w:pPr>
@@ -5357,6 +5497,7 @@
           </w:tcPr>
           <w:p>
             <w:pPr>
+              <w:keepLines/>
               <w:spacing w:after="0" w:line="259" w:lineRule="auto"/>
               <w:jc w:val="left"/>
             </w:pPr>
@@ -5391,6 +5532,7 @@
           </w:tcPr>
           <w:p>
             <w:pPr>
+              <w:keepLines/>
               <w:spacing w:after="0" w:line="259" w:lineRule="auto"/>
               <w:jc w:val="left"/>
             </w:pPr>
@@ -5425,6 +5567,7 @@
           </w:tcPr>
           <w:p>
             <w:pPr>
+              <w:keepLines/>
               <w:spacing w:after="0" w:line="259" w:lineRule="auto"/>
               <w:jc w:val="left"/>
             </w:pPr>
@@ -5460,6 +5603,7 @@
           </w:tcPr>
           <w:p>
             <w:pPr>
+              <w:keepLines/>
               <w:spacing w:after="0" w:line="259" w:lineRule="auto"/>
               <w:jc w:val="left"/>
             </w:pPr>
@@ -5493,6 +5637,7 @@
           </w:tcPr>
           <w:p>
             <w:pPr>
+              <w:keepLines/>
               <w:spacing w:after="0" w:line="259" w:lineRule="auto"/>
               <w:jc w:val="left"/>
             </w:pPr>
@@ -5526,6 +5671,7 @@
           </w:tcPr>
           <w:p>
             <w:pPr>
+              <w:keepLines/>
               <w:spacing w:after="0" w:line="259" w:lineRule="auto"/>
               <w:jc w:val="left"/>
             </w:pPr>
@@ -5559,6 +5705,7 @@
           </w:tcPr>
           <w:p>
             <w:pPr>
+              <w:keepLines/>
               <w:spacing w:after="0" w:line="259" w:lineRule="auto"/>
               <w:jc w:val="left"/>
             </w:pPr>
@@ -5595,6 +5742,7 @@
           </w:tcPr>
           <w:p>
             <w:pPr>
+              <w:keepLines/>
               <w:spacing w:after="0" w:line="259" w:lineRule="auto"/>
               <w:jc w:val="left"/>
             </w:pPr>
@@ -5629,6 +5777,7 @@
           </w:tcPr>
           <w:p>
             <w:pPr>
+              <w:keepLines/>
               <w:spacing w:after="0" w:line="259" w:lineRule="auto"/>
               <w:jc w:val="left"/>
             </w:pPr>
@@ -5663,6 +5812,7 @@
           </w:tcPr>
           <w:p>
             <w:pPr>
+              <w:keepLines/>
               <w:spacing w:after="0" w:line="259" w:lineRule="auto"/>
               <w:jc w:val="left"/>
             </w:pPr>
@@ -5697,6 +5847,7 @@
           </w:tcPr>
           <w:p>
             <w:pPr>
+              <w:keepLines/>
               <w:spacing w:after="0" w:line="259" w:lineRule="auto"/>
               <w:jc w:val="left"/>
             </w:pPr>
@@ -5732,6 +5883,7 @@
           </w:tcPr>
           <w:p>
             <w:pPr>
+              <w:keepLines/>
               <w:spacing w:after="0" w:line="259" w:lineRule="auto"/>
               <w:jc w:val="left"/>
             </w:pPr>
@@ -5765,6 +5917,7 @@
           </w:tcPr>
           <w:p>
             <w:pPr>
+              <w:keepLines/>
               <w:spacing w:after="0" w:line="259" w:lineRule="auto"/>
               <w:jc w:val="left"/>
             </w:pPr>
@@ -5798,6 +5951,7 @@
           </w:tcPr>
           <w:p>
             <w:pPr>
+              <w:keepLines/>
               <w:spacing w:after="0" w:line="259" w:lineRule="auto"/>
               <w:jc w:val="left"/>
             </w:pPr>
@@ -5831,6 +5985,7 @@
           </w:tcPr>
           <w:p>
             <w:pPr>
+              <w:keepLines/>
               <w:spacing w:after="0" w:line="259" w:lineRule="auto"/>
               <w:jc w:val="left"/>
             </w:pPr>
@@ -5867,6 +6022,7 @@
           </w:tcPr>
           <w:p>
             <w:pPr>
+              <w:keepLines/>
               <w:spacing w:after="0" w:line="259" w:lineRule="auto"/>
               <w:jc w:val="left"/>
             </w:pPr>
@@ -5901,6 +6057,7 @@
           </w:tcPr>
           <w:p>
             <w:pPr>
+              <w:keepLines/>
               <w:spacing w:after="0" w:line="259" w:lineRule="auto"/>
               <w:jc w:val="left"/>
             </w:pPr>
@@ -5935,6 +6092,7 @@
           </w:tcPr>
           <w:p>
             <w:pPr>
+              <w:keepLines/>
               <w:spacing w:after="0" w:line="259" w:lineRule="auto"/>
               <w:jc w:val="left"/>
             </w:pPr>
@@ -5969,6 +6127,7 @@
           </w:tcPr>
           <w:p>
             <w:pPr>
+              <w:keepLines/>
               <w:spacing w:after="0" w:line="259" w:lineRule="auto"/>
               <w:jc w:val="left"/>
             </w:pPr>
@@ -6004,6 +6163,7 @@
           </w:tcPr>
           <w:p>
             <w:pPr>
+              <w:keepLines/>
               <w:spacing w:after="0" w:line="259" w:lineRule="auto"/>
               <w:jc w:val="left"/>
             </w:pPr>
@@ -6037,6 +6197,7 @@
           </w:tcPr>
           <w:p>
             <w:pPr>
+              <w:keepLines/>
               <w:spacing w:after="0" w:line="259" w:lineRule="auto"/>
               <w:jc w:val="left"/>
             </w:pPr>
@@ -6070,6 +6231,7 @@
           </w:tcPr>
           <w:p>
             <w:pPr>
+              <w:keepLines/>
               <w:spacing w:after="0" w:line="259" w:lineRule="auto"/>
               <w:jc w:val="left"/>
             </w:pPr>
@@ -6103,6 +6265,7 @@
           </w:tcPr>
           <w:p>
             <w:pPr>
+              <w:keepLines/>
               <w:spacing w:after="0" w:line="259" w:lineRule="auto"/>
               <w:jc w:val="left"/>
             </w:pPr>
@@ -6140,6 +6303,7 @@
           </w:tcPr>
           <w:p>
             <w:pPr>
+              <w:keepLines/>
               <w:spacing w:after="0" w:line="259" w:lineRule="auto"/>
               <w:jc w:val="left"/>
             </w:pPr>
@@ -6174,6 +6338,7 @@
           </w:tcPr>
           <w:p>
             <w:pPr>
+              <w:keepLines/>
               <w:spacing w:after="0" w:line="259" w:lineRule="auto"/>
               <w:jc w:val="left"/>
             </w:pPr>
@@ -6208,6 +6373,7 @@
           </w:tcPr>
           <w:p>
             <w:pPr>
+              <w:keepLines/>
               <w:spacing w:after="0" w:line="259" w:lineRule="auto"/>
               <w:jc w:val="left"/>
             </w:pPr>
@@ -6242,6 +6408,7 @@
           </w:tcPr>
           <w:p>
             <w:pPr>
+              <w:keepLines/>
               <w:spacing w:after="0" w:line="259" w:lineRule="auto"/>
               <w:jc w:val="center"/>
             </w:pPr>
@@ -6301,12 +6468,7 @@
         <w:pStyle w:val="Heading1"/>
       </w:pPr>
       <w:r>
-        <w:rPr>
-          <w:rFonts w:ascii="Aptos" w:hAnsi="Aptos"/>
-          <w:color w:val="1F2937"/>
-          <w:sz w:val="19"/>
-        </w:rPr>
-        <w:t>14. Hardware-related software completion lanes</w:t>
+        <w:t>15. Hardware-related software completion lanes</w:t>
       </w:r>
     </w:p>
     <w:p>
@@ -6411,12 +6573,7 @@
         <w:pStyle w:val="Heading1"/>
       </w:pPr>
       <w:r>
-        <w:rPr>
-          <w:rFonts w:ascii="Aptos" w:hAnsi="Aptos"/>
-          <w:color w:val="1F2937"/>
-          <w:sz w:val="19"/>
-        </w:rPr>
-        <w:t>15. Daily executive velocity dashboard</w:t>
+        <w:t>16. Daily executive velocity dashboard</w:t>
       </w:r>
     </w:p>
     <w:p>
@@ -6551,6 +6708,14 @@
         <w:pStyle w:val="ListBullet"/>
       </w:pPr>
       <w:r>
+        <w:t>representative desktop and narrow-view density findings, including critical information displaced below the fold;</w:t>
+      </w:r>
+    </w:p>
+    <w:p>
+      <w:pPr>
+        <w:pStyle w:val="ListBullet"/>
+      </w:pPr>
+      <w:r>
         <w:rPr>
           <w:rFonts w:ascii="Aptos" w:hAnsi="Aptos"/>
           <w:color w:val="1F2937"/>
@@ -6600,12 +6765,7 @@
         <w:pStyle w:val="Heading1"/>
       </w:pPr>
       <w:r>
-        <w:rPr>
-          <w:rFonts w:ascii="Aptos" w:hAnsi="Aptos"/>
-          <w:color w:val="1F2937"/>
-          <w:sz w:val="19"/>
-        </w:rPr>
-        <w:t>16. Commercial truth rules</w:t>
+        <w:t>17. Commercial truth rules</w:t>
       </w:r>
     </w:p>
     <w:p>
@@ -6735,12 +6895,7 @@
         <w:pStyle w:val="Heading1"/>
       </w:pPr>
       <w:r>
-        <w:rPr>
-          <w:rFonts w:ascii="Aptos" w:hAnsi="Aptos"/>
-          <w:color w:val="1F2937"/>
-          <w:sz w:val="19"/>
-        </w:rPr>
-        <w:t>17. Change control</w:t>
+        <w:t>18. Change control</w:t>
       </w:r>
     </w:p>
     <w:p>
@@ -6820,12 +6975,7 @@
         <w:pStyle w:val="Heading1"/>
       </w:pPr>
       <w:r>
-        <w:rPr>
-          <w:rFonts w:ascii="Aptos" w:hAnsi="Aptos"/>
-          <w:color w:val="1F2937"/>
-          <w:sz w:val="19"/>
-        </w:rPr>
-        <w:t>18. Required next actions</w:t>
+        <w:t>19. Required next actions</w:t>
       </w:r>
     </w:p>
     <w:p>
@@ -6834,18 +6984,7 @@
         <w:ind w:left="317" w:hanging="317"/>
       </w:pPr>
       <w:r>
-        <w:rPr>
-          <w:b/>
-        </w:rPr>
-        <w:t xml:space="preserve">1.  </w:t>
-      </w:r>
-      <w:r>
-        <w:rPr>
-          <w:rFonts w:ascii="Aptos" w:hAnsi="Aptos"/>
-          <w:color w:val="1F2937"/>
-          <w:sz w:val="19"/>
-        </w:rPr>
-        <w:t>Finish and independently verify the current camera authority/truth batch; freeze it only after all integration gates pass.</w:t>
+        <w:t>1.  Finish and independently verify the current camera authority/truth batch; freeze it only after all integration gates pass.</w:t>
       </w:r>
     </w:p>
     <w:p>
@@ -6854,18 +6993,7 @@
         <w:ind w:left="317" w:hanging="317"/>
       </w:pPr>
       <w:r>
-        <w:rPr>
-          <w:b/>
-        </w:rPr>
-        <w:t xml:space="preserve">2.  </w:t>
-      </w:r>
-      <w:r>
-        <w:rPr>
-          <w:rFonts w:ascii="Aptos" w:hAnsi="Aptos"/>
-          <w:color w:val="1F2937"/>
-          <w:sz w:val="19"/>
-        </w:rPr>
-        <w:t>Continue software-controllable DeviceOps, sensor, J1939, PT40, GT06 and provider work in bounded vertical batches.</w:t>
+        <w:t>2.  Complete the shared shell and high-priority fleet, camera, telematics, sensor and device density batch, then verify representative desktop, narrow, loading, empty and failure states.</w:t>
       </w:r>
     </w:p>
     <w:p>
@@ -6874,18 +7002,7 @@
         <w:ind w:left="317" w:hanging="317"/>
       </w:pPr>
       <w:r>
-        <w:rPr>
-          <w:b/>
-        </w:rPr>
-        <w:t xml:space="preserve">3.  </w:t>
-      </w:r>
-      <w:r>
-        <w:rPr>
-          <w:rFonts w:ascii="Aptos" w:hAnsi="Aptos"/>
-          <w:color w:val="1F2937"/>
-          <w:sz w:val="19"/>
-        </w:rPr>
-        <w:t>Maintain an external procurement ledger naming the exact device or provider access needed for each final confirmation gate.</w:t>
+        <w:t>3.  Continue software-controllable DeviceOps, sensor, J1939, PT40, GT06 and provider work in bounded vertical batches.</w:t>
       </w:r>
     </w:p>
     <w:p>
@@ -6894,18 +7011,7 @@
         <w:ind w:left="317" w:hanging="317"/>
       </w:pPr>
       <w:r>
-        <w:rPr>
-          <w:b/>
-        </w:rPr>
-        <w:t xml:space="preserve">4.  </w:t>
-      </w:r>
-      <w:r>
-        <w:rPr>
-          <w:rFonts w:ascii="Aptos" w:hAnsi="Aptos"/>
-          <w:color w:val="1F2937"/>
-          <w:sz w:val="19"/>
-        </w:rPr>
-        <w:t>Prepare repeatable physical test scripts, evidence templates and reference measurements before hardware arrives.</w:t>
+        <w:t>4.  Maintain an external procurement ledger naming the exact device or provider access needed for each final confirmation gate.</w:t>
       </w:r>
     </w:p>
     <w:p>
@@ -6914,18 +7020,7 @@
         <w:ind w:left="317" w:hanging="317"/>
       </w:pPr>
       <w:r>
-        <w:rPr>
-          <w:b/>
-        </w:rPr>
-        <w:t xml:space="preserve">5.  </w:t>
-      </w:r>
-      <w:r>
-        <w:rPr>
-          <w:rFonts w:ascii="Aptos" w:hAnsi="Aptos"/>
-          <w:color w:val="1F2937"/>
-          <w:sz w:val="19"/>
-        </w:rPr>
-        <w:t>Form at most two frozen certification candidates from integrated meaningful batches.</w:t>
+        <w:t>5.  Prepare repeatable physical test scripts, evidence templates and reference measurements before hardware arrives.</w:t>
       </w:r>
     </w:p>
     <w:p>
@@ -6934,18 +7029,7 @@
         <w:ind w:left="317" w:hanging="317"/>
       </w:pPr>
       <w:r>
-        <w:rPr>
-          <w:b/>
-        </w:rPr>
-        <w:t xml:space="preserve">6.  </w:t>
-      </w:r>
-      <w:r>
-        <w:rPr>
-          <w:rFonts w:ascii="Aptos" w:hAnsi="Aptos"/>
-          <w:color w:val="1F2937"/>
-          <w:sz w:val="19"/>
-        </w:rPr>
-        <w:t>Keep the production POC truthful: demo labels visible, no invented provider/media/AI claims, and exact deployed identity observable.</w:t>
+        <w:t>6.  Form at most two frozen certification candidates from integrated meaningful batches.</w:t>
       </w:r>
     </w:p>
     <w:p>
@@ -6954,18 +7038,13 @@
         <w:ind w:left="317" w:hanging="317"/>
       </w:pPr>
       <w:r>
-        <w:rPr>
-          <w:b/>
-        </w:rPr>
-        <w:t xml:space="preserve">7.  </w:t>
+        <w:t>7.  Keep the production POC truthful: demo labels visible, no invented provider/media/AI claims, and exact deployed identity observable.</w:t>
       </w:r>
+    </w:p>
+    <w:p>
+      <w:pPr/>
       <w:r>
-        <w:rPr>
-          <w:rFonts w:ascii="Aptos" w:hAnsi="Aptos"/>
-          <w:color w:val="1F2937"/>
-          <w:sz w:val="19"/>
-        </w:rPr>
-        <w:t>Update #110 and the daily executive dashboard with software movement, external holds and actual certification eligibility.</w:t>
+        <w:t>8.  Update #110 and the daily executive dashboard with software movement, external holds and actual certification eligibility.</w:t>
       </w:r>
     </w:p>
     <w:p>
@@ -6973,12 +7052,7 @@
         <w:pStyle w:val="Heading1"/>
       </w:pPr>
       <w:r>
-        <w:rPr>
-          <w:rFonts w:ascii="Aptos" w:hAnsi="Aptos"/>
-          <w:color w:val="1F2937"/>
-          <w:sz w:val="19"/>
-        </w:rPr>
-        <w:t>19. End state</w:t>
+        <w:t>20. End state</w:t>
       </w:r>
     </w:p>
     <w:p>
@@ -7293,9 +7367,67 @@
         <w:t>Keeps overall commercial release at NOT GO and all real hardware/provider/regulatory gaps visible.</w:t>
       </w:r>
     </w:p>
+    <w:p>
+      <w:pPr>
+        <w:pStyle w:val="Heading1"/>
+      </w:pPr>
+      <w:r>
+        <w:t>Controlled revision 2.8 update</w:t>
+      </w:r>
+    </w:p>
+    <w:p>
+      <w:pPr>
+        <w:pStyle w:val="ListBullet"/>
+      </w:pPr>
+      <w:r>
+        <w:t>Makes efficient page-space use, information priority and responsive density a binding cross-cutting product standard.</w:t>
+      </w:r>
+    </w:p>
+    <w:p>
+      <w:pPr>
+        <w:pStyle w:val="ListBullet"/>
+      </w:pPr>
+      <w:r>
+        <w:t>Requires the shared shell, navigation, headings, action controls, KPI strips, filters, tables and status panels to preserve working space while remaining accessible.</w:t>
+      </w:r>
+    </w:p>
+    <w:p>
+      <w:pPr>
+        <w:pStyle w:val="ListBullet"/>
+      </w:pPr>
+      <w:r>
+        <w:t>Requires loading, empty, unavailable and failure states to stay proportional to their content and show a truthful recovery path without consuming an otherwise empty viewport.</w:t>
+      </w:r>
+    </w:p>
+    <w:p>
+      <w:pPr>
+        <w:pStyle w:val="ListBullet"/>
+      </w:pPr>
+      <w:r>
+        <w:t>Adds representative desktop, narrow, zoom, large-data and failure-state review to BUILD, INTEGRATE and frozen-candidate browser evidence.</w:t>
+      </w:r>
+    </w:p>
+    <w:p>
+      <w:pPr>
+        <w:pStyle w:val="ListBullet"/>
+      </w:pPr>
+      <w:r>
+        <w:t>Records current main 2ed4e4295136118711fb7dcfd7db29d0ce3a3a42 and production POC software 294a20ded52b7f6a3c4d689fa0de7d0b3fbe7efa as of 2026-09-08.</w:t>
+      </w:r>
+    </w:p>
+    <w:p>
+      <w:pPr>
+        <w:pStyle w:val="ListBullet"/>
+      </w:pPr>
+      <w:r>
+        <w:t>Records the observed production POC failures on Camera Metadata, Fleet Overview and Telematics Control Tower as open acceptance blockers rather than inferred passes.</w:t>
+      </w:r>
+    </w:p>
     <w:sectPr>
       <w:headerReference w:type="default" r:id="rId9"/>
       <w:footerReference w:type="default" r:id="rId10"/>
+      <w:footerReference w:type="first" r:id="rId11"/>
+      <w:footerReference w:type="even" r:id="rId12"/>
       <w:pgSz w:w="12240" w:h="15840"/>
       <w:pgMar w:top="1037" w:right="1037" w:bottom="936" w:left="1037" w:header="461" w:footer="461" w:gutter="0"/>
       <w:cols w:space="720"/>
@@ -7319,7 +7451,7 @@
         <w:color w:val="5B6573"/>
         <w:sz w:val="16"/>
       </w:rPr>
-      <w:t xml:space="preserve">Factory model 2.0   |   Controlled plan revision 2.7   |   Page </w:t>
+      <w:t xml:space="preserve">Factory model 2.0   |   Controlled plan revision 2.8   |   Page </w:t>
     </w:r>
     <w:fldSimple w:instr=" PAGE ">
       <w:r>
@@ -7330,6 +7462,26 @@
         <w:t>1</w:t>
       </w:r>
     </w:fldSimple>
+  </w:p>
+</w:ftr>
+</file>
+
+<file path=word/footer2.xml><?xml version="1.0" encoding="utf-8"?>
+<w:ftr xmlns:m="http://schemas.openxmlformats.org/officeDocument/2006/math" xmlns:mc="http://schemas.openxmlformats.org/markup-compatibility/2006" xmlns:mo="http://schemas.microsoft.com/office/mac/office/2008/main" xmlns:mv="urn:schemas-microsoft-com:mac:vml" xmlns:o="urn:schemas-microsoft-com:office:office" xmlns:r="http://schemas.openxmlformats.org/officeDocument/2006/relationships" xmlns:v="urn:schemas-microsoft-com:vml" xmlns:w10="urn:schemas-microsoft-com:office:word" xmlns:w14="http://schemas.microsoft.com/office/word/2010/wordml" xmlns:w="http://schemas.openxmlformats.org/wordprocessingml/2006/main" xmlns:wne="http://schemas.microsoft.com/office/word/2006/wordml" xmlns:wp14="http://schemas.microsoft.com/office/word/2010/wordprocessingDrawing" xmlns:wp="http://schemas.openxmlformats.org/drawingml/2006/wordprocessingDrawing" xmlns:wpc="http://schemas.microsoft.com/office/word/2010/wordprocessingCanvas" xmlns:wpg="http://schemas.microsoft.com/office/word/2010/wordprocessingGroup" xmlns:wpi="http://schemas.microsoft.com/office/word/2010/wordprocessingInk" xmlns:wps="http://schemas.microsoft.com/office/word/2010/wordprocessingShape" mc:Ignorable="w14 wp14">
+  <w:p>
+    <w:pPr>
+      <w:pStyle w:val="Footer"/>
+    </w:pPr>
+  </w:p>
+</w:ftr>
+</file>
+
+<file path=word/footer3.xml><?xml version="1.0" encoding="utf-8"?>
+<w:ftr xmlns:m="http://schemas.openxmlformats.org/officeDocument/2006/math" xmlns:mc="http://schemas.openxmlformats.org/markup-compatibility/2006" xmlns:mo="http://schemas.microsoft.com/office/mac/office/2008/main" xmlns:mv="urn:schemas-microsoft-com:mac:vml" xmlns:o="urn:schemas-microsoft-com:office:office" xmlns:r="http://schemas.openxmlformats.org/officeDocument/2006/relationships" xmlns:v="urn:schemas-microsoft-com:vml" xmlns:w10="urn:schemas-microsoft-com:office:word" xmlns:w14="http://schemas.microsoft.com/office/word/2010/wordml" xmlns:w="http://schemas.openxmlformats.org/wordprocessingml/2006/main" xmlns:wne="http://schemas.microsoft.com/office/word/2006/wordml" xmlns:wp14="http://schemas.microsoft.com/office/word/2010/wordprocessingDrawing" xmlns:wp="http://schemas.openxmlformats.org/drawingml/2006/wordprocessingDrawing" xmlns:wpc="http://schemas.microsoft.com/office/word/2010/wordprocessingCanvas" xmlns:wpg="http://schemas.microsoft.com/office/word/2010/wordprocessingGroup" xmlns:wpi="http://schemas.microsoft.com/office/word/2010/wordprocessingInk" xmlns:wps="http://schemas.microsoft.com/office/word/2010/wordprocessingShape" mc:Ignorable="w14 wp14">
+  <w:p>
+    <w:pPr>
+      <w:pStyle w:val="Footer"/>
+    </w:pPr>
   </w:p>
 </w:ftr>
 </file>

</xml_diff>

<commit_message>
test(poc): align proof retirement and publish factory v2
</commit_message>
<xml_diff>
--- a/docs/commercialization/artifacts/OpsTrax_Accelerated_Hardening_Factory_v2.0.docx
+++ b/docs/commercialization/artifacts/OpsTrax_Accelerated_Hardening_Factory_v2.0.docx
@@ -4430,8 +4430,63 @@
       </w:r>
     </w:p>
     <w:p>
+      <w:pPr>
+        <w:pStyle w:val="Heading2"/>
+      </w:pPr>
       <w:r>
-        <w:t>Live GitHub and production state was verified on 2026-09-08.</w:t>
+        <w:t>Adoption baseline on 2026-09-02</w:t>
+      </w:r>
+    </w:p>
+    <w:p>
+      <w:pPr/>
+      <w:r>
+        <w:t>The following is the dated historical snapshot used when the Accelerated Hardening Factory v2.0 was adopted. It establishes the transition from v1.1 and v1.2; it is not a claim about the repository after that date.</w:t>
+      </w:r>
+    </w:p>
+    <w:p>
+      <w:pPr>
+        <w:pStyle w:val="ListBullet"/>
+      </w:pPr>
+      <w:r>
+        <w:t>Wave 1 G1A was merged and closed under a time-bounded LIMITED GO; M1/M2 remained PILOT.</w:t>
+      </w:r>
+    </w:p>
+    <w:p>
+      <w:pPr>
+        <w:pStyle w:val="ListBullet"/>
+      </w:pPr>
+      <w:r>
+        <w:t>GT06 physical certification was deferred on EXTERNAL HOLD and remained NOT CERTIFIED.</w:t>
+      </w:r>
+    </w:p>
+    <w:p>
+      <w:pPr>
+        <w:pStyle w:val="ListBullet"/>
+      </w:pPr>
+      <w:r>
+        <w:t>Wave 2 was active through #115 for Samsara and #116 for certified ELD partner selection and integration readiness.</w:t>
+      </w:r>
+    </w:p>
+    <w:p>
+      <w:pPr>
+        <w:pStyle w:val="ListBullet"/>
+      </w:pPr>
+      <w:r>
+        <w:t>PRs #118 and #119 were merged; PR #120 was active for Samsara truth and recovery hardening.</w:t>
+      </w:r>
+    </w:p>
+    <w:p>
+      <w:pPr>
+        <w:pStyle w:val="Heading2"/>
+      </w:pPr>
+      <w:r>
+        <w:t>Later verified truth on 2026-09-08</w:t>
+      </w:r>
+    </w:p>
+    <w:p>
+      <w:pPr/>
+      <w:r>
+        <w:t>The later repository and production facts below supersede the adoption snapshot wherever status changed.</w:t>
       </w:r>
     </w:p>
     <w:p>
@@ -4455,12 +4510,7 @@
         <w:pStyle w:val="ListBullet"/>
       </w:pPr>
       <w:r>
-        <w:rPr>
-          <w:rFonts w:ascii="Aptos" w:hAnsi="Aptos"/>
-          <w:color w:val="1F2937"/>
-          <w:sz w:val="19"/>
-        </w:rPr>
-        <w:t>The original v2.0 activation snapshot recorded PRs #118 and #119 merged and PR #120 active. PR #120 has since merged.</w:t>
+        <w:t>PR #120 has since merged.</w:t>
       </w:r>
     </w:p>
     <w:p>
@@ -7246,6 +7296,22 @@
     </w:p>
     <w:p>
       <w:pPr>
+        <w:pStyle w:val="ListBullet"/>
+      </w:pPr>
+      <w:r>
+        <w:t>Records the dated 2026-09-02 adoption baseline: Wave 1 G1A merged and closed under a time-bounded LIMITED GO with M1/M2 still PILOT; GT06 physical certification deferred and NOT CERTIFIED; Wave 2 active; PRs #118 and #119 merged; and PR #120 active.</w:t>
+      </w:r>
+    </w:p>
+    <w:p>
+      <w:pPr>
+        <w:pStyle w:val="ListBullet"/>
+      </w:pPr>
+      <w:r>
+        <w:t>Treats that adoption baseline as historical. Later dated repository and production facts supersede it wherever status changed, including the later merge of PR #120.</w:t>
+      </w:r>
+    </w:p>
+    <w:p>
+      <w:pPr>
         <w:pStyle w:val="Heading1"/>
       </w:pPr>
       <w:r>

</xml_diff>